<commit_message>
docs: add the built screens' messages to the UI message catalogue
Section 7 now also lists 20 messages that the built screens show but
the catalogue did not have, each under its own screen:

- Learners (US-003): family name required, duplicate name warning,
  saved, could not be saved, empty list
- Attendance (US-004): added and marked present, already on the list,
  change could not be saved, class session not found
- Correct past attendance (US-015): correction notice, class is today,
  no changes yet
- Māori review (US-008): reviewer name and review date messages, lesson
  not marked as Māori content, review saved
- Learner sign-in (US-012): too many tries, sign-in not working, names
  required

The section 7 introduction and the status line note the update.

Refs: US-003, US-004, US-008, US-012, US-015
</commit_message>
<xml_diff>
--- a/docs/system_design/Ako_UI_Design_Document.docx
+++ b/docs/system_design/Ako_UI_Design_Document.docx
@@ -40,7 +40,7 @@
           <w:i/>
           <w:sz w:val="20"/>
         </w:rPr>
-        <w:t>Status: draft for team review, 19 October 2026. Based on the user stories of 19 October (17 stories, 61 story points, owners and sprints as in the Scrum Plan) and the requirements specification. Screens for stories planned for later are marked "Later". Wireframes show layout and content, not final colours or graphics. Names and dates in the examples are made up.</w:t>
+        <w:t>Status: draft for team review, 19 October 2026. Based on the user stories of 19 October (17 stories, 61 story points, owners and sprints as in the Scrum Plan) and the requirements specification. Screens for stories planned for later are marked "Later". Wireframes show layout and content, not final colours or graphics. Names and dates in the examples are made up. Updated 26 October 2026: the message catalogue (section 7) now also lists the messages of the built screens for US-003, US-004, US-008, US-012 and US-015.</w:t>
       </w:r>
     </w:p>
     <w:p>
@@ -14678,7 +14678,7 @@
           <w:b w:val="0"/>
           <w:i w:val="0"/>
         </w:rPr>
-        <w:t>All user-visible messages from the acceptance criteria, so wording stays the same across screens and tests.</w:t>
+        <w:t>All user-visible messages from the acceptance criteria and the built screens, so wording stays the same across screens and tests.</w:t>
       </w:r>
     </w:p>
     <w:tbl>
@@ -15141,7 +15141,7 @@
                 <w:b w:val="0"/>
                 <w:sz w:val="18"/>
               </w:rPr>
-              <w:t>Class sessions</w:t>
+              <w:t>Learners</w:t>
             </w:r>
           </w:p>
         </w:tc>
@@ -15159,7 +15159,7 @@
                 <w:b w:val="0"/>
                 <w:sz w:val="18"/>
               </w:rPr>
-              <w:t>Date cannot be in the future</w:t>
+              <w:t>Family name is required</w:t>
             </w:r>
           </w:p>
         </w:tc>
@@ -15200,7 +15200,7 @@
                 <w:b w:val="0"/>
                 <w:sz w:val="18"/>
               </w:rPr>
-              <w:t>Class sessions</w:t>
+              <w:t>Learners</w:t>
             </w:r>
           </w:p>
         </w:tc>
@@ -15218,7 +15218,7 @@
                 <w:b w:val="0"/>
                 <w:sz w:val="18"/>
               </w:rPr>
-              <w:t>This session has attendance and cannot be deleted</w:t>
+              <w:t>A learner with this name already exists</w:t>
             </w:r>
           </w:p>
         </w:tc>
@@ -15236,7 +15236,7 @@
                 <w:b w:val="0"/>
                 <w:sz w:val="18"/>
               </w:rPr>
-              <w:t>Error</w:t>
+              <w:t>Warning</w:t>
             </w:r>
           </w:p>
         </w:tc>
@@ -15259,7 +15259,7 @@
                 <w:b w:val="0"/>
                 <w:sz w:val="18"/>
               </w:rPr>
-              <w:t>Attendance</w:t>
+              <w:t>Learners</w:t>
             </w:r>
           </w:p>
         </w:tc>
@@ -15277,7 +15277,7 @@
                 <w:b w:val="0"/>
                 <w:sz w:val="18"/>
               </w:rPr>
-              <w:t>Already signed in</w:t>
+              <w:t>Learner saved</w:t>
             </w:r>
           </w:p>
         </w:tc>
@@ -15295,7 +15295,7 @@
                 <w:b w:val="0"/>
                 <w:sz w:val="18"/>
               </w:rPr>
-              <w:t>Information</w:t>
+              <w:t>Success</w:t>
             </w:r>
           </w:p>
         </w:tc>
@@ -15318,7 +15318,7 @@
                 <w:b w:val="0"/>
                 <w:sz w:val="18"/>
               </w:rPr>
-              <w:t>Correct past attendance</w:t>
+              <w:t>Learners</w:t>
             </w:r>
           </w:p>
         </w:tc>
@@ -15336,7 +15336,7 @@
                 <w:b w:val="0"/>
                 <w:sz w:val="18"/>
               </w:rPr>
-              <w:t>Only a coordinator can correct past attendance</w:t>
+              <w:t>The learner could not be saved. Please try again.</w:t>
             </w:r>
           </w:p>
         </w:tc>
@@ -15354,7 +15354,7 @@
                 <w:b w:val="0"/>
                 <w:sz w:val="18"/>
               </w:rPr>
-              <w:t>Warning</w:t>
+              <w:t>Error</w:t>
             </w:r>
           </w:p>
         </w:tc>
@@ -15377,7 +15377,7 @@
                 <w:b w:val="0"/>
                 <w:sz w:val="18"/>
               </w:rPr>
-              <w:t>Import learners</w:t>
+              <w:t>Learners</w:t>
             </w:r>
           </w:p>
         </w:tc>
@@ -15395,7 +15395,7 @@
                 <w:b w:val="0"/>
                 <w:sz w:val="18"/>
               </w:rPr>
-              <w:t>10 learners imported (number varies)</w:t>
+              <w:t>No learners yet. Use Add learner to start the class list.</w:t>
             </w:r>
           </w:p>
         </w:tc>
@@ -15413,7 +15413,7 @@
                 <w:b w:val="0"/>
                 <w:sz w:val="18"/>
               </w:rPr>
-              <w:t>Success</w:t>
+              <w:t>Information</w:t>
             </w:r>
           </w:p>
         </w:tc>
@@ -15436,7 +15436,7 @@
                 <w:b w:val="0"/>
                 <w:sz w:val="18"/>
               </w:rPr>
-              <w:t>Import learners</w:t>
+              <w:t>Class sessions</w:t>
             </w:r>
           </w:p>
         </w:tc>
@@ -15454,7 +15454,7 @@
                 <w:b w:val="0"/>
                 <w:sz w:val="18"/>
               </w:rPr>
-              <w:t>Row [n]: First name is required</w:t>
+              <w:t>Date cannot be in the future</w:t>
             </w:r>
           </w:p>
         </w:tc>
@@ -15495,7 +15495,7 @@
                 <w:b w:val="0"/>
                 <w:sz w:val="18"/>
               </w:rPr>
-              <w:t>Import learners</w:t>
+              <w:t>Class sessions</w:t>
             </w:r>
           </w:p>
         </w:tc>
@@ -15513,7 +15513,7 @@
                 <w:b w:val="0"/>
                 <w:sz w:val="18"/>
               </w:rPr>
-              <w:t>Row [n]: Name must be 100 characters or fewer</w:t>
+              <w:t>This session has attendance and cannot be deleted</w:t>
             </w:r>
           </w:p>
         </w:tc>
@@ -15554,7 +15554,7 @@
                 <w:b w:val="0"/>
                 <w:sz w:val="18"/>
               </w:rPr>
-              <w:t>Learner history</w:t>
+              <w:t>Attendance</w:t>
             </w:r>
           </w:p>
         </w:tc>
@@ -15572,7 +15572,7 @@
                 <w:b w:val="0"/>
                 <w:sz w:val="18"/>
               </w:rPr>
-              <w:t>No attendance recorded yet</w:t>
+              <w:t>Already signed in</w:t>
             </w:r>
           </w:p>
         </w:tc>
@@ -15613,7 +15613,7 @@
                 <w:b w:val="0"/>
                 <w:sz w:val="18"/>
               </w:rPr>
-              <w:t>Attendance reports</w:t>
+              <w:t>Attendance</w:t>
             </w:r>
           </w:p>
         </w:tc>
@@ -15631,7 +15631,7 @@
                 <w:b w:val="0"/>
                 <w:sz w:val="18"/>
               </w:rPr>
-              <w:t>No classes found for these dates</w:t>
+              <w:t>[Name] is added to the class list and marked present</w:t>
             </w:r>
           </w:p>
         </w:tc>
@@ -15649,7 +15649,7 @@
                 <w:b w:val="0"/>
                 <w:sz w:val="18"/>
               </w:rPr>
-              <w:t>Warning</w:t>
+              <w:t>Success</w:t>
             </w:r>
           </w:p>
         </w:tc>
@@ -15672,7 +15672,7 @@
                 <w:b w:val="0"/>
                 <w:sz w:val="18"/>
               </w:rPr>
-              <w:t>Attendance reports</w:t>
+              <w:t>Attendance</w:t>
             </w:r>
           </w:p>
         </w:tc>
@@ -15690,7 +15690,7 @@
                 <w:b w:val="0"/>
                 <w:sz w:val="18"/>
               </w:rPr>
-              <w:t>Start date must be before end date</w:t>
+              <w:t>[Name] is already on the class list and is now marked present</w:t>
             </w:r>
           </w:p>
         </w:tc>
@@ -15708,7 +15708,7 @@
                 <w:b w:val="0"/>
                 <w:sz w:val="18"/>
               </w:rPr>
-              <w:t>Error</w:t>
+              <w:t>Information</w:t>
             </w:r>
           </w:p>
         </w:tc>
@@ -15731,7 +15731,7 @@
                 <w:b w:val="0"/>
                 <w:sz w:val="18"/>
               </w:rPr>
-              <w:t>Lesson form</w:t>
+              <w:t>Attendance</w:t>
             </w:r>
           </w:p>
         </w:tc>
@@ -15749,7 +15749,7 @@
                 <w:b w:val="0"/>
                 <w:sz w:val="18"/>
               </w:rPr>
-              <w:t>Title is required</w:t>
+              <w:t>The change could not be saved. Please try again.</w:t>
             </w:r>
           </w:p>
         </w:tc>
@@ -15790,7 +15790,7 @@
                 <w:b w:val="0"/>
                 <w:sz w:val="18"/>
               </w:rPr>
-              <w:t>Lesson library</w:t>
+              <w:t>Attendance</w:t>
             </w:r>
           </w:p>
         </w:tc>
@@ -15808,7 +15808,7 @@
                 <w:b w:val="0"/>
                 <w:sz w:val="18"/>
               </w:rPr>
-              <w:t>No lessons found</w:t>
+              <w:t>Class session not found</w:t>
             </w:r>
           </w:p>
         </w:tc>
@@ -15826,7 +15826,7 @@
                 <w:b w:val="0"/>
                 <w:sz w:val="18"/>
               </w:rPr>
-              <w:t>Information</w:t>
+              <w:t>Error</w:t>
             </w:r>
           </w:p>
         </w:tc>
@@ -15849,7 +15849,7 @@
                 <w:b w:val="0"/>
                 <w:sz w:val="18"/>
               </w:rPr>
-              <w:t>Lesson library</w:t>
+              <w:t>Correct past attendance</w:t>
             </w:r>
           </w:p>
         </w:tc>
@@ -15867,7 +15867,7 @@
                 <w:b w:val="0"/>
                 <w:sz w:val="18"/>
               </w:rPr>
-              <w:t>Lesson date is required</w:t>
+              <w:t>Only a coordinator can correct past attendance</w:t>
             </w:r>
           </w:p>
         </w:tc>
@@ -15885,7 +15885,7 @@
                 <w:b w:val="0"/>
                 <w:sz w:val="18"/>
               </w:rPr>
-              <w:t>Error</w:t>
+              <w:t>Warning</w:t>
             </w:r>
           </w:p>
         </w:tc>
@@ -15908,7 +15908,7 @@
                 <w:b w:val="0"/>
                 <w:sz w:val="18"/>
               </w:rPr>
-              <w:t>Māori review</w:t>
+              <w:t>Correct past attendance</w:t>
             </w:r>
           </w:p>
         </w:tc>
@@ -15926,7 +15926,7 @@
                 <w:b w:val="0"/>
                 <w:sz w:val="18"/>
               </w:rPr>
-              <w:t>Māori content – not yet reviewed</w:t>
+              <w:t>You are correcting a past class. Every change is logged with your name and the time</w:t>
             </w:r>
           </w:p>
         </w:tc>
@@ -15944,7 +15944,7 @@
                 <w:b w:val="0"/>
                 <w:sz w:val="18"/>
               </w:rPr>
-              <w:t>Label (amber)</w:t>
+              <w:t>Information</w:t>
             </w:r>
           </w:p>
         </w:tc>
@@ -15967,7 +15967,7 @@
                 <w:b w:val="0"/>
                 <w:sz w:val="18"/>
               </w:rPr>
-              <w:t>Māori review</w:t>
+              <w:t>Correct past attendance</w:t>
             </w:r>
           </w:p>
         </w:tc>
@@ -15985,7 +15985,7 @@
                 <w:b w:val="0"/>
                 <w:sz w:val="18"/>
               </w:rPr>
-              <w:t>Reviewed by [name], [date]</w:t>
+              <w:t>This class is today. Change it on the class list</w:t>
             </w:r>
           </w:p>
         </w:tc>
@@ -16003,7 +16003,7 @@
                 <w:b w:val="0"/>
                 <w:sz w:val="18"/>
               </w:rPr>
-              <w:t>Label (green)</w:t>
+              <w:t>Warning</w:t>
             </w:r>
           </w:p>
         </w:tc>
@@ -16026,7 +16026,7 @@
                 <w:b w:val="0"/>
                 <w:sz w:val="18"/>
               </w:rPr>
-              <w:t>Public page</w:t>
+              <w:t>Correct past attendance</w:t>
             </w:r>
           </w:p>
         </w:tc>
@@ -16044,7 +16044,7 @@
                 <w:b w:val="0"/>
                 <w:sz w:val="18"/>
               </w:rPr>
-              <w:t>Page not found</w:t>
+              <w:t>No changes yet.</w:t>
             </w:r>
           </w:p>
         </w:tc>
@@ -16085,7 +16085,7 @@
                 <w:b w:val="0"/>
                 <w:sz w:val="18"/>
               </w:rPr>
-              <w:t>Interest form</w:t>
+              <w:t>Import learners</w:t>
             </w:r>
           </w:p>
         </w:tc>
@@ -16103,7 +16103,7 @@
                 <w:b w:val="0"/>
                 <w:sz w:val="18"/>
               </w:rPr>
-              <w:t>Please enter a valid email address</w:t>
+              <w:t>10 learners imported (number varies)</w:t>
             </w:r>
           </w:p>
         </w:tc>
@@ -16121,7 +16121,7 @@
                 <w:b w:val="0"/>
                 <w:sz w:val="18"/>
               </w:rPr>
-              <w:t>Error</w:t>
+              <w:t>Success</w:t>
             </w:r>
           </w:p>
         </w:tc>
@@ -16144,7 +16144,7 @@
                 <w:b w:val="0"/>
                 <w:sz w:val="18"/>
               </w:rPr>
-              <w:t>Interest form</w:t>
+              <w:t>Import learners</w:t>
             </w:r>
           </w:p>
         </w:tc>
@@ -16162,7 +16162,7 @@
                 <w:b w:val="0"/>
                 <w:sz w:val="18"/>
               </w:rPr>
-              <w:t>Message must be 500 characters or fewer</w:t>
+              <w:t>Row [n]: First name is required</w:t>
             </w:r>
           </w:p>
         </w:tc>
@@ -16203,7 +16203,7 @@
                 <w:b w:val="0"/>
                 <w:sz w:val="18"/>
               </w:rPr>
-              <w:t>Interest form</w:t>
+              <w:t>Import learners</w:t>
             </w:r>
           </w:p>
         </w:tc>
@@ -16221,7 +16221,7 @@
                 <w:b w:val="0"/>
                 <w:sz w:val="18"/>
               </w:rPr>
-              <w:t>Thank you, the club will contact you</w:t>
+              <w:t>Row [n]: Name must be 100 characters or fewer</w:t>
             </w:r>
           </w:p>
         </w:tc>
@@ -16239,7 +16239,7 @@
                 <w:b w:val="0"/>
                 <w:sz w:val="18"/>
               </w:rPr>
-              <w:t>Success</w:t>
+              <w:t>Error</w:t>
             </w:r>
           </w:p>
         </w:tc>
@@ -16262,7 +16262,7 @@
                 <w:b w:val="0"/>
                 <w:sz w:val="18"/>
               </w:rPr>
-              <w:t>Learner sign-in</w:t>
+              <w:t>Learner history</w:t>
             </w:r>
           </w:p>
         </w:tc>
@@ -16280,7 +16280,7 @@
                 <w:b w:val="0"/>
                 <w:sz w:val="18"/>
               </w:rPr>
-              <w:t>You are signed in</w:t>
+              <w:t>No attendance recorded yet</w:t>
             </w:r>
           </w:p>
         </w:tc>
@@ -16298,7 +16298,7 @@
                 <w:b w:val="0"/>
                 <w:sz w:val="18"/>
               </w:rPr>
-              <w:t>Success</w:t>
+              <w:t>Information</w:t>
             </w:r>
           </w:p>
         </w:tc>
@@ -16321,7 +16321,7 @@
                 <w:b w:val="0"/>
                 <w:sz w:val="18"/>
               </w:rPr>
-              <w:t>Learner sign-in</w:t>
+              <w:t>Attendance reports</w:t>
             </w:r>
           </w:p>
         </w:tc>
@@ -16339,7 +16339,7 @@
                 <w:b w:val="0"/>
                 <w:sz w:val="18"/>
               </w:rPr>
-              <w:t>We could not find that name. Please ask the teacher</w:t>
+              <w:t>No classes found for these dates</w:t>
             </w:r>
           </w:p>
         </w:tc>
@@ -16357,7 +16357,7 @@
                 <w:b w:val="0"/>
                 <w:sz w:val="18"/>
               </w:rPr>
-              <w:t>Error</w:t>
+              <w:t>Warning</w:t>
             </w:r>
           </w:p>
         </w:tc>
@@ -16380,6 +16380,891 @@
                 <w:b w:val="0"/>
                 <w:sz w:val="18"/>
               </w:rPr>
+              <w:t>Attendance reports</w:t>
+            </w:r>
+          </w:p>
+        </w:tc>
+        <w:tc>
+          <w:tcPr>
+            <w:tcW w:type="dxa" w:w="5556"/>
+          </w:tcPr>
+          <w:p>
+            <w:pPr>
+              <w:spacing w:after="0"/>
+            </w:pPr>
+            <w:r/>
+            <w:r>
+              <w:rPr>
+                <w:b w:val="0"/>
+                <w:sz w:val="18"/>
+              </w:rPr>
+              <w:t>Start date must be before end date</w:t>
+            </w:r>
+          </w:p>
+        </w:tc>
+        <w:tc>
+          <w:tcPr>
+            <w:tcW w:type="dxa" w:w="1701"/>
+          </w:tcPr>
+          <w:p>
+            <w:pPr>
+              <w:spacing w:after="0"/>
+            </w:pPr>
+            <w:r/>
+            <w:r>
+              <w:rPr>
+                <w:b w:val="0"/>
+                <w:sz w:val="18"/>
+              </w:rPr>
+              <w:t>Error</w:t>
+            </w:r>
+          </w:p>
+        </w:tc>
+      </w:tr>
+      <w:tr>
+        <w:trPr>
+          <w:cantSplit/>
+        </w:trPr>
+        <w:tc>
+          <w:tcPr>
+            <w:tcW w:type="dxa" w:w="2381"/>
+          </w:tcPr>
+          <w:p>
+            <w:pPr>
+              <w:spacing w:after="0"/>
+            </w:pPr>
+            <w:r/>
+            <w:r>
+              <w:rPr>
+                <w:b w:val="0"/>
+                <w:sz w:val="18"/>
+              </w:rPr>
+              <w:t>Lesson form</w:t>
+            </w:r>
+          </w:p>
+        </w:tc>
+        <w:tc>
+          <w:tcPr>
+            <w:tcW w:type="dxa" w:w="5556"/>
+          </w:tcPr>
+          <w:p>
+            <w:pPr>
+              <w:spacing w:after="0"/>
+            </w:pPr>
+            <w:r/>
+            <w:r>
+              <w:rPr>
+                <w:b w:val="0"/>
+                <w:sz w:val="18"/>
+              </w:rPr>
+              <w:t>Title is required</w:t>
+            </w:r>
+          </w:p>
+        </w:tc>
+        <w:tc>
+          <w:tcPr>
+            <w:tcW w:type="dxa" w:w="1701"/>
+          </w:tcPr>
+          <w:p>
+            <w:pPr>
+              <w:spacing w:after="0"/>
+            </w:pPr>
+            <w:r/>
+            <w:r>
+              <w:rPr>
+                <w:b w:val="0"/>
+                <w:sz w:val="18"/>
+              </w:rPr>
+              <w:t>Error</w:t>
+            </w:r>
+          </w:p>
+        </w:tc>
+      </w:tr>
+      <w:tr>
+        <w:trPr>
+          <w:cantSplit/>
+        </w:trPr>
+        <w:tc>
+          <w:tcPr>
+            <w:tcW w:type="dxa" w:w="2381"/>
+          </w:tcPr>
+          <w:p>
+            <w:pPr>
+              <w:spacing w:after="0"/>
+            </w:pPr>
+            <w:r/>
+            <w:r>
+              <w:rPr>
+                <w:b w:val="0"/>
+                <w:sz w:val="18"/>
+              </w:rPr>
+              <w:t>Lesson library</w:t>
+            </w:r>
+          </w:p>
+        </w:tc>
+        <w:tc>
+          <w:tcPr>
+            <w:tcW w:type="dxa" w:w="5556"/>
+          </w:tcPr>
+          <w:p>
+            <w:pPr>
+              <w:spacing w:after="0"/>
+            </w:pPr>
+            <w:r/>
+            <w:r>
+              <w:rPr>
+                <w:b w:val="0"/>
+                <w:sz w:val="18"/>
+              </w:rPr>
+              <w:t>No lessons found</w:t>
+            </w:r>
+          </w:p>
+        </w:tc>
+        <w:tc>
+          <w:tcPr>
+            <w:tcW w:type="dxa" w:w="1701"/>
+          </w:tcPr>
+          <w:p>
+            <w:pPr>
+              <w:spacing w:after="0"/>
+            </w:pPr>
+            <w:r/>
+            <w:r>
+              <w:rPr>
+                <w:b w:val="0"/>
+                <w:sz w:val="18"/>
+              </w:rPr>
+              <w:t>Information</w:t>
+            </w:r>
+          </w:p>
+        </w:tc>
+      </w:tr>
+      <w:tr>
+        <w:trPr>
+          <w:cantSplit/>
+        </w:trPr>
+        <w:tc>
+          <w:tcPr>
+            <w:tcW w:type="dxa" w:w="2381"/>
+          </w:tcPr>
+          <w:p>
+            <w:pPr>
+              <w:spacing w:after="0"/>
+            </w:pPr>
+            <w:r/>
+            <w:r>
+              <w:rPr>
+                <w:b w:val="0"/>
+                <w:sz w:val="18"/>
+              </w:rPr>
+              <w:t>Lesson library</w:t>
+            </w:r>
+          </w:p>
+        </w:tc>
+        <w:tc>
+          <w:tcPr>
+            <w:tcW w:type="dxa" w:w="5556"/>
+          </w:tcPr>
+          <w:p>
+            <w:pPr>
+              <w:spacing w:after="0"/>
+            </w:pPr>
+            <w:r/>
+            <w:r>
+              <w:rPr>
+                <w:b w:val="0"/>
+                <w:sz w:val="18"/>
+              </w:rPr>
+              <w:t>Lesson date is required</w:t>
+            </w:r>
+          </w:p>
+        </w:tc>
+        <w:tc>
+          <w:tcPr>
+            <w:tcW w:type="dxa" w:w="1701"/>
+          </w:tcPr>
+          <w:p>
+            <w:pPr>
+              <w:spacing w:after="0"/>
+            </w:pPr>
+            <w:r/>
+            <w:r>
+              <w:rPr>
+                <w:b w:val="0"/>
+                <w:sz w:val="18"/>
+              </w:rPr>
+              <w:t>Error</w:t>
+            </w:r>
+          </w:p>
+        </w:tc>
+      </w:tr>
+      <w:tr>
+        <w:trPr>
+          <w:cantSplit/>
+        </w:trPr>
+        <w:tc>
+          <w:tcPr>
+            <w:tcW w:type="dxa" w:w="2381"/>
+          </w:tcPr>
+          <w:p>
+            <w:pPr>
+              <w:spacing w:after="0"/>
+            </w:pPr>
+            <w:r/>
+            <w:r>
+              <w:rPr>
+                <w:b w:val="0"/>
+                <w:sz w:val="18"/>
+              </w:rPr>
+              <w:t>Māori review</w:t>
+            </w:r>
+          </w:p>
+        </w:tc>
+        <w:tc>
+          <w:tcPr>
+            <w:tcW w:type="dxa" w:w="5556"/>
+          </w:tcPr>
+          <w:p>
+            <w:pPr>
+              <w:spacing w:after="0"/>
+            </w:pPr>
+            <w:r/>
+            <w:r>
+              <w:rPr>
+                <w:b w:val="0"/>
+                <w:sz w:val="18"/>
+              </w:rPr>
+              <w:t>Māori content – not yet reviewed</w:t>
+            </w:r>
+          </w:p>
+        </w:tc>
+        <w:tc>
+          <w:tcPr>
+            <w:tcW w:type="dxa" w:w="1701"/>
+          </w:tcPr>
+          <w:p>
+            <w:pPr>
+              <w:spacing w:after="0"/>
+            </w:pPr>
+            <w:r/>
+            <w:r>
+              <w:rPr>
+                <w:b w:val="0"/>
+                <w:sz w:val="18"/>
+              </w:rPr>
+              <w:t>Label (amber)</w:t>
+            </w:r>
+          </w:p>
+        </w:tc>
+      </w:tr>
+      <w:tr>
+        <w:trPr>
+          <w:cantSplit/>
+        </w:trPr>
+        <w:tc>
+          <w:tcPr>
+            <w:tcW w:type="dxa" w:w="2381"/>
+          </w:tcPr>
+          <w:p>
+            <w:pPr>
+              <w:spacing w:after="0"/>
+            </w:pPr>
+            <w:r/>
+            <w:r>
+              <w:rPr>
+                <w:b w:val="0"/>
+                <w:sz w:val="18"/>
+              </w:rPr>
+              <w:t>Māori review</w:t>
+            </w:r>
+          </w:p>
+        </w:tc>
+        <w:tc>
+          <w:tcPr>
+            <w:tcW w:type="dxa" w:w="5556"/>
+          </w:tcPr>
+          <w:p>
+            <w:pPr>
+              <w:spacing w:after="0"/>
+            </w:pPr>
+            <w:r/>
+            <w:r>
+              <w:rPr>
+                <w:b w:val="0"/>
+                <w:sz w:val="18"/>
+              </w:rPr>
+              <w:t>Reviewed by [name], [date]</w:t>
+            </w:r>
+          </w:p>
+        </w:tc>
+        <w:tc>
+          <w:tcPr>
+            <w:tcW w:type="dxa" w:w="1701"/>
+          </w:tcPr>
+          <w:p>
+            <w:pPr>
+              <w:spacing w:after="0"/>
+            </w:pPr>
+            <w:r/>
+            <w:r>
+              <w:rPr>
+                <w:b w:val="0"/>
+                <w:sz w:val="18"/>
+              </w:rPr>
+              <w:t>Label (green)</w:t>
+            </w:r>
+          </w:p>
+        </w:tc>
+      </w:tr>
+      <w:tr>
+        <w:trPr>
+          <w:cantSplit/>
+        </w:trPr>
+        <w:tc>
+          <w:tcPr>
+            <w:tcW w:type="dxa" w:w="2381"/>
+          </w:tcPr>
+          <w:p>
+            <w:pPr>
+              <w:spacing w:after="0"/>
+            </w:pPr>
+            <w:r/>
+            <w:r>
+              <w:rPr>
+                <w:b w:val="0"/>
+                <w:sz w:val="18"/>
+              </w:rPr>
+              <w:t>Māori review</w:t>
+            </w:r>
+          </w:p>
+        </w:tc>
+        <w:tc>
+          <w:tcPr>
+            <w:tcW w:type="dxa" w:w="5556"/>
+          </w:tcPr>
+          <w:p>
+            <w:pPr>
+              <w:spacing w:after="0"/>
+            </w:pPr>
+            <w:r/>
+            <w:r>
+              <w:rPr>
+                <w:b w:val="0"/>
+                <w:sz w:val="18"/>
+              </w:rPr>
+              <w:t>Reviewer name is required</w:t>
+            </w:r>
+          </w:p>
+        </w:tc>
+        <w:tc>
+          <w:tcPr>
+            <w:tcW w:type="dxa" w:w="1701"/>
+          </w:tcPr>
+          <w:p>
+            <w:pPr>
+              <w:spacing w:after="0"/>
+            </w:pPr>
+            <w:r/>
+            <w:r>
+              <w:rPr>
+                <w:b w:val="0"/>
+                <w:sz w:val="18"/>
+              </w:rPr>
+              <w:t>Error</w:t>
+            </w:r>
+          </w:p>
+        </w:tc>
+      </w:tr>
+      <w:tr>
+        <w:trPr>
+          <w:cantSplit/>
+        </w:trPr>
+        <w:tc>
+          <w:tcPr>
+            <w:tcW w:type="dxa" w:w="2381"/>
+          </w:tcPr>
+          <w:p>
+            <w:pPr>
+              <w:spacing w:after="0"/>
+            </w:pPr>
+            <w:r/>
+            <w:r>
+              <w:rPr>
+                <w:b w:val="0"/>
+                <w:sz w:val="18"/>
+              </w:rPr>
+              <w:t>Māori review</w:t>
+            </w:r>
+          </w:p>
+        </w:tc>
+        <w:tc>
+          <w:tcPr>
+            <w:tcW w:type="dxa" w:w="5556"/>
+          </w:tcPr>
+          <w:p>
+            <w:pPr>
+              <w:spacing w:after="0"/>
+            </w:pPr>
+            <w:r/>
+            <w:r>
+              <w:rPr>
+                <w:b w:val="0"/>
+                <w:sz w:val="18"/>
+              </w:rPr>
+              <w:t>Review date is required</w:t>
+            </w:r>
+          </w:p>
+        </w:tc>
+        <w:tc>
+          <w:tcPr>
+            <w:tcW w:type="dxa" w:w="1701"/>
+          </w:tcPr>
+          <w:p>
+            <w:pPr>
+              <w:spacing w:after="0"/>
+            </w:pPr>
+            <w:r/>
+            <w:r>
+              <w:rPr>
+                <w:b w:val="0"/>
+                <w:sz w:val="18"/>
+              </w:rPr>
+              <w:t>Error</w:t>
+            </w:r>
+          </w:p>
+        </w:tc>
+      </w:tr>
+      <w:tr>
+        <w:trPr>
+          <w:cantSplit/>
+        </w:trPr>
+        <w:tc>
+          <w:tcPr>
+            <w:tcW w:type="dxa" w:w="2381"/>
+          </w:tcPr>
+          <w:p>
+            <w:pPr>
+              <w:spacing w:after="0"/>
+            </w:pPr>
+            <w:r/>
+            <w:r>
+              <w:rPr>
+                <w:b w:val="0"/>
+                <w:sz w:val="18"/>
+              </w:rPr>
+              <w:t>Māori review</w:t>
+            </w:r>
+          </w:p>
+        </w:tc>
+        <w:tc>
+          <w:tcPr>
+            <w:tcW w:type="dxa" w:w="5556"/>
+          </w:tcPr>
+          <w:p>
+            <w:pPr>
+              <w:spacing w:after="0"/>
+            </w:pPr>
+            <w:r/>
+            <w:r>
+              <w:rPr>
+                <w:b w:val="0"/>
+                <w:sz w:val="18"/>
+              </w:rPr>
+              <w:t>Review date cannot be in the future</w:t>
+            </w:r>
+          </w:p>
+        </w:tc>
+        <w:tc>
+          <w:tcPr>
+            <w:tcW w:type="dxa" w:w="1701"/>
+          </w:tcPr>
+          <w:p>
+            <w:pPr>
+              <w:spacing w:after="0"/>
+            </w:pPr>
+            <w:r/>
+            <w:r>
+              <w:rPr>
+                <w:b w:val="0"/>
+                <w:sz w:val="18"/>
+              </w:rPr>
+              <w:t>Error</w:t>
+            </w:r>
+          </w:p>
+        </w:tc>
+      </w:tr>
+      <w:tr>
+        <w:trPr>
+          <w:cantSplit/>
+        </w:trPr>
+        <w:tc>
+          <w:tcPr>
+            <w:tcW w:type="dxa" w:w="2381"/>
+          </w:tcPr>
+          <w:p>
+            <w:pPr>
+              <w:spacing w:after="0"/>
+            </w:pPr>
+            <w:r/>
+            <w:r>
+              <w:rPr>
+                <w:b w:val="0"/>
+                <w:sz w:val="18"/>
+              </w:rPr>
+              <w:t>Māori review</w:t>
+            </w:r>
+          </w:p>
+        </w:tc>
+        <w:tc>
+          <w:tcPr>
+            <w:tcW w:type="dxa" w:w="5556"/>
+          </w:tcPr>
+          <w:p>
+            <w:pPr>
+              <w:spacing w:after="0"/>
+            </w:pPr>
+            <w:r/>
+            <w:r>
+              <w:rPr>
+                <w:b w:val="0"/>
+                <w:sz w:val="18"/>
+              </w:rPr>
+              <w:t>This lesson is not marked as containing Māori content</w:t>
+            </w:r>
+          </w:p>
+        </w:tc>
+        <w:tc>
+          <w:tcPr>
+            <w:tcW w:type="dxa" w:w="1701"/>
+          </w:tcPr>
+          <w:p>
+            <w:pPr>
+              <w:spacing w:after="0"/>
+            </w:pPr>
+            <w:r/>
+            <w:r>
+              <w:rPr>
+                <w:b w:val="0"/>
+                <w:sz w:val="18"/>
+              </w:rPr>
+              <w:t>Error</w:t>
+            </w:r>
+          </w:p>
+        </w:tc>
+      </w:tr>
+      <w:tr>
+        <w:trPr>
+          <w:cantSplit/>
+        </w:trPr>
+        <w:tc>
+          <w:tcPr>
+            <w:tcW w:type="dxa" w:w="2381"/>
+          </w:tcPr>
+          <w:p>
+            <w:pPr>
+              <w:spacing w:after="0"/>
+            </w:pPr>
+            <w:r/>
+            <w:r>
+              <w:rPr>
+                <w:b w:val="0"/>
+                <w:sz w:val="18"/>
+              </w:rPr>
+              <w:t>Māori review</w:t>
+            </w:r>
+          </w:p>
+        </w:tc>
+        <w:tc>
+          <w:tcPr>
+            <w:tcW w:type="dxa" w:w="5556"/>
+          </w:tcPr>
+          <w:p>
+            <w:pPr>
+              <w:spacing w:after="0"/>
+            </w:pPr>
+            <w:r/>
+            <w:r>
+              <w:rPr>
+                <w:b w:val="0"/>
+                <w:sz w:val="18"/>
+              </w:rPr>
+              <w:t>Review saved</w:t>
+            </w:r>
+          </w:p>
+        </w:tc>
+        <w:tc>
+          <w:tcPr>
+            <w:tcW w:type="dxa" w:w="1701"/>
+          </w:tcPr>
+          <w:p>
+            <w:pPr>
+              <w:spacing w:after="0"/>
+            </w:pPr>
+            <w:r/>
+            <w:r>
+              <w:rPr>
+                <w:b w:val="0"/>
+                <w:sz w:val="18"/>
+              </w:rPr>
+              <w:t>Success</w:t>
+            </w:r>
+          </w:p>
+        </w:tc>
+      </w:tr>
+      <w:tr>
+        <w:trPr>
+          <w:cantSplit/>
+        </w:trPr>
+        <w:tc>
+          <w:tcPr>
+            <w:tcW w:type="dxa" w:w="2381"/>
+          </w:tcPr>
+          <w:p>
+            <w:pPr>
+              <w:spacing w:after="0"/>
+            </w:pPr>
+            <w:r/>
+            <w:r>
+              <w:rPr>
+                <w:b w:val="0"/>
+                <w:sz w:val="18"/>
+              </w:rPr>
+              <w:t>Public page</w:t>
+            </w:r>
+          </w:p>
+        </w:tc>
+        <w:tc>
+          <w:tcPr>
+            <w:tcW w:type="dxa" w:w="5556"/>
+          </w:tcPr>
+          <w:p>
+            <w:pPr>
+              <w:spacing w:after="0"/>
+            </w:pPr>
+            <w:r/>
+            <w:r>
+              <w:rPr>
+                <w:b w:val="0"/>
+                <w:sz w:val="18"/>
+              </w:rPr>
+              <w:t>Page not found</w:t>
+            </w:r>
+          </w:p>
+        </w:tc>
+        <w:tc>
+          <w:tcPr>
+            <w:tcW w:type="dxa" w:w="1701"/>
+          </w:tcPr>
+          <w:p>
+            <w:pPr>
+              <w:spacing w:after="0"/>
+            </w:pPr>
+            <w:r/>
+            <w:r>
+              <w:rPr>
+                <w:b w:val="0"/>
+                <w:sz w:val="18"/>
+              </w:rPr>
+              <w:t>Information</w:t>
+            </w:r>
+          </w:p>
+        </w:tc>
+      </w:tr>
+      <w:tr>
+        <w:trPr>
+          <w:cantSplit/>
+        </w:trPr>
+        <w:tc>
+          <w:tcPr>
+            <w:tcW w:type="dxa" w:w="2381"/>
+          </w:tcPr>
+          <w:p>
+            <w:pPr>
+              <w:spacing w:after="0"/>
+            </w:pPr>
+            <w:r/>
+            <w:r>
+              <w:rPr>
+                <w:b w:val="0"/>
+                <w:sz w:val="18"/>
+              </w:rPr>
+              <w:t>Interest form</w:t>
+            </w:r>
+          </w:p>
+        </w:tc>
+        <w:tc>
+          <w:tcPr>
+            <w:tcW w:type="dxa" w:w="5556"/>
+          </w:tcPr>
+          <w:p>
+            <w:pPr>
+              <w:spacing w:after="0"/>
+            </w:pPr>
+            <w:r/>
+            <w:r>
+              <w:rPr>
+                <w:b w:val="0"/>
+                <w:sz w:val="18"/>
+              </w:rPr>
+              <w:t>Please enter a valid email address</w:t>
+            </w:r>
+          </w:p>
+        </w:tc>
+        <w:tc>
+          <w:tcPr>
+            <w:tcW w:type="dxa" w:w="1701"/>
+          </w:tcPr>
+          <w:p>
+            <w:pPr>
+              <w:spacing w:after="0"/>
+            </w:pPr>
+            <w:r/>
+            <w:r>
+              <w:rPr>
+                <w:b w:val="0"/>
+                <w:sz w:val="18"/>
+              </w:rPr>
+              <w:t>Error</w:t>
+            </w:r>
+          </w:p>
+        </w:tc>
+      </w:tr>
+      <w:tr>
+        <w:trPr>
+          <w:cantSplit/>
+        </w:trPr>
+        <w:tc>
+          <w:tcPr>
+            <w:tcW w:type="dxa" w:w="2381"/>
+          </w:tcPr>
+          <w:p>
+            <w:pPr>
+              <w:spacing w:after="0"/>
+            </w:pPr>
+            <w:r/>
+            <w:r>
+              <w:rPr>
+                <w:b w:val="0"/>
+                <w:sz w:val="18"/>
+              </w:rPr>
+              <w:t>Interest form</w:t>
+            </w:r>
+          </w:p>
+        </w:tc>
+        <w:tc>
+          <w:tcPr>
+            <w:tcW w:type="dxa" w:w="5556"/>
+          </w:tcPr>
+          <w:p>
+            <w:pPr>
+              <w:spacing w:after="0"/>
+            </w:pPr>
+            <w:r/>
+            <w:r>
+              <w:rPr>
+                <w:b w:val="0"/>
+                <w:sz w:val="18"/>
+              </w:rPr>
+              <w:t>Message must be 500 characters or fewer</w:t>
+            </w:r>
+          </w:p>
+        </w:tc>
+        <w:tc>
+          <w:tcPr>
+            <w:tcW w:type="dxa" w:w="1701"/>
+          </w:tcPr>
+          <w:p>
+            <w:pPr>
+              <w:spacing w:after="0"/>
+            </w:pPr>
+            <w:r/>
+            <w:r>
+              <w:rPr>
+                <w:b w:val="0"/>
+                <w:sz w:val="18"/>
+              </w:rPr>
+              <w:t>Error</w:t>
+            </w:r>
+          </w:p>
+        </w:tc>
+      </w:tr>
+      <w:tr>
+        <w:trPr>
+          <w:cantSplit/>
+        </w:trPr>
+        <w:tc>
+          <w:tcPr>
+            <w:tcW w:type="dxa" w:w="2381"/>
+          </w:tcPr>
+          <w:p>
+            <w:pPr>
+              <w:spacing w:after="0"/>
+            </w:pPr>
+            <w:r/>
+            <w:r>
+              <w:rPr>
+                <w:b w:val="0"/>
+                <w:sz w:val="18"/>
+              </w:rPr>
+              <w:t>Interest form</w:t>
+            </w:r>
+          </w:p>
+        </w:tc>
+        <w:tc>
+          <w:tcPr>
+            <w:tcW w:type="dxa" w:w="5556"/>
+          </w:tcPr>
+          <w:p>
+            <w:pPr>
+              <w:spacing w:after="0"/>
+            </w:pPr>
+            <w:r/>
+            <w:r>
+              <w:rPr>
+                <w:b w:val="0"/>
+                <w:sz w:val="18"/>
+              </w:rPr>
+              <w:t>Thank you, the club will contact you</w:t>
+            </w:r>
+          </w:p>
+        </w:tc>
+        <w:tc>
+          <w:tcPr>
+            <w:tcW w:type="dxa" w:w="1701"/>
+          </w:tcPr>
+          <w:p>
+            <w:pPr>
+              <w:spacing w:after="0"/>
+            </w:pPr>
+            <w:r/>
+            <w:r>
+              <w:rPr>
+                <w:b w:val="0"/>
+                <w:sz w:val="18"/>
+              </w:rPr>
+              <w:t>Success</w:t>
+            </w:r>
+          </w:p>
+        </w:tc>
+      </w:tr>
+      <w:tr>
+        <w:trPr>
+          <w:cantSplit/>
+        </w:trPr>
+        <w:tc>
+          <w:tcPr>
+            <w:tcW w:type="dxa" w:w="2381"/>
+          </w:tcPr>
+          <w:p>
+            <w:pPr>
+              <w:spacing w:after="0"/>
+            </w:pPr>
+            <w:r/>
+            <w:r>
+              <w:rPr>
+                <w:b w:val="0"/>
+                <w:sz w:val="18"/>
+              </w:rPr>
               <w:t>Learner sign-in</w:t>
             </w:r>
           </w:p>
@@ -16398,6 +17283,124 @@
                 <w:b w:val="0"/>
                 <w:sz w:val="18"/>
               </w:rPr>
+              <w:t>You are signed in</w:t>
+            </w:r>
+          </w:p>
+        </w:tc>
+        <w:tc>
+          <w:tcPr>
+            <w:tcW w:type="dxa" w:w="1701"/>
+          </w:tcPr>
+          <w:p>
+            <w:pPr>
+              <w:spacing w:after="0"/>
+            </w:pPr>
+            <w:r/>
+            <w:r>
+              <w:rPr>
+                <w:b w:val="0"/>
+                <w:sz w:val="18"/>
+              </w:rPr>
+              <w:t>Success</w:t>
+            </w:r>
+          </w:p>
+        </w:tc>
+      </w:tr>
+      <w:tr>
+        <w:trPr>
+          <w:cantSplit/>
+        </w:trPr>
+        <w:tc>
+          <w:tcPr>
+            <w:tcW w:type="dxa" w:w="2381"/>
+          </w:tcPr>
+          <w:p>
+            <w:pPr>
+              <w:spacing w:after="0"/>
+            </w:pPr>
+            <w:r/>
+            <w:r>
+              <w:rPr>
+                <w:b w:val="0"/>
+                <w:sz w:val="18"/>
+              </w:rPr>
+              <w:t>Learner sign-in</w:t>
+            </w:r>
+          </w:p>
+        </w:tc>
+        <w:tc>
+          <w:tcPr>
+            <w:tcW w:type="dxa" w:w="5556"/>
+          </w:tcPr>
+          <w:p>
+            <w:pPr>
+              <w:spacing w:after="0"/>
+            </w:pPr>
+            <w:r/>
+            <w:r>
+              <w:rPr>
+                <w:b w:val="0"/>
+                <w:sz w:val="18"/>
+              </w:rPr>
+              <w:t>We could not find that name. Please ask the teacher</w:t>
+            </w:r>
+          </w:p>
+        </w:tc>
+        <w:tc>
+          <w:tcPr>
+            <w:tcW w:type="dxa" w:w="1701"/>
+          </w:tcPr>
+          <w:p>
+            <w:pPr>
+              <w:spacing w:after="0"/>
+            </w:pPr>
+            <w:r/>
+            <w:r>
+              <w:rPr>
+                <w:b w:val="0"/>
+                <w:sz w:val="18"/>
+              </w:rPr>
+              <w:t>Error</w:t>
+            </w:r>
+          </w:p>
+        </w:tc>
+      </w:tr>
+      <w:tr>
+        <w:trPr>
+          <w:cantSplit/>
+        </w:trPr>
+        <w:tc>
+          <w:tcPr>
+            <w:tcW w:type="dxa" w:w="2381"/>
+          </w:tcPr>
+          <w:p>
+            <w:pPr>
+              <w:spacing w:after="0"/>
+            </w:pPr>
+            <w:r/>
+            <w:r>
+              <w:rPr>
+                <w:b w:val="0"/>
+                <w:sz w:val="18"/>
+              </w:rPr>
+              <w:t>Learner sign-in</w:t>
+            </w:r>
+          </w:p>
+        </w:tc>
+        <w:tc>
+          <w:tcPr>
+            <w:tcW w:type="dxa" w:w="5556"/>
+          </w:tcPr>
+          <w:p>
+            <w:pPr>
+              <w:spacing w:after="0"/>
+            </w:pPr>
+            <w:r/>
+            <w:r>
+              <w:rPr>
+                <w:b w:val="0"/>
+                <w:sz w:val="18"/>
+              </w:rPr>
               <w:t>Check-in is closed. Please ask the teacher</w:t>
             </w:r>
           </w:p>
@@ -16417,6 +17420,183 @@
                 <w:sz w:val="18"/>
               </w:rPr>
               <w:t>Warning</w:t>
+            </w:r>
+          </w:p>
+        </w:tc>
+      </w:tr>
+      <w:tr>
+        <w:trPr>
+          <w:cantSplit/>
+        </w:trPr>
+        <w:tc>
+          <w:tcPr>
+            <w:tcW w:type="dxa" w:w="2381"/>
+          </w:tcPr>
+          <w:p>
+            <w:pPr>
+              <w:spacing w:after="0"/>
+            </w:pPr>
+            <w:r/>
+            <w:r>
+              <w:rPr>
+                <w:b w:val="0"/>
+                <w:sz w:val="18"/>
+              </w:rPr>
+              <w:t>Learner sign-in</w:t>
+            </w:r>
+          </w:p>
+        </w:tc>
+        <w:tc>
+          <w:tcPr>
+            <w:tcW w:type="dxa" w:w="5556"/>
+          </w:tcPr>
+          <w:p>
+            <w:pPr>
+              <w:spacing w:after="0"/>
+            </w:pPr>
+            <w:r/>
+            <w:r>
+              <w:rPr>
+                <w:b w:val="0"/>
+                <w:sz w:val="18"/>
+              </w:rPr>
+              <w:t>Too many tries. Please ask the teacher</w:t>
+            </w:r>
+          </w:p>
+        </w:tc>
+        <w:tc>
+          <w:tcPr>
+            <w:tcW w:type="dxa" w:w="1701"/>
+          </w:tcPr>
+          <w:p>
+            <w:pPr>
+              <w:spacing w:after="0"/>
+            </w:pPr>
+            <w:r/>
+            <w:r>
+              <w:rPr>
+                <w:b w:val="0"/>
+                <w:sz w:val="18"/>
+              </w:rPr>
+              <w:t>Warning</w:t>
+            </w:r>
+          </w:p>
+        </w:tc>
+      </w:tr>
+      <w:tr>
+        <w:trPr>
+          <w:cantSplit/>
+        </w:trPr>
+        <w:tc>
+          <w:tcPr>
+            <w:tcW w:type="dxa" w:w="2381"/>
+          </w:tcPr>
+          <w:p>
+            <w:pPr>
+              <w:spacing w:after="0"/>
+            </w:pPr>
+            <w:r/>
+            <w:r>
+              <w:rPr>
+                <w:b w:val="0"/>
+                <w:sz w:val="18"/>
+              </w:rPr>
+              <w:t>Learner sign-in</w:t>
+            </w:r>
+          </w:p>
+        </w:tc>
+        <w:tc>
+          <w:tcPr>
+            <w:tcW w:type="dxa" w:w="5556"/>
+          </w:tcPr>
+          <w:p>
+            <w:pPr>
+              <w:spacing w:after="0"/>
+            </w:pPr>
+            <w:r/>
+            <w:r>
+              <w:rPr>
+                <w:b w:val="0"/>
+                <w:sz w:val="18"/>
+              </w:rPr>
+              <w:t>Sign-in is not working right now. Please ask the teacher</w:t>
+            </w:r>
+          </w:p>
+        </w:tc>
+        <w:tc>
+          <w:tcPr>
+            <w:tcW w:type="dxa" w:w="1701"/>
+          </w:tcPr>
+          <w:p>
+            <w:pPr>
+              <w:spacing w:after="0"/>
+            </w:pPr>
+            <w:r/>
+            <w:r>
+              <w:rPr>
+                <w:b w:val="0"/>
+                <w:sz w:val="18"/>
+              </w:rPr>
+              <w:t>Error</w:t>
+            </w:r>
+          </w:p>
+        </w:tc>
+      </w:tr>
+      <w:tr>
+        <w:trPr>
+          <w:cantSplit/>
+        </w:trPr>
+        <w:tc>
+          <w:tcPr>
+            <w:tcW w:type="dxa" w:w="2381"/>
+          </w:tcPr>
+          <w:p>
+            <w:pPr>
+              <w:spacing w:after="0"/>
+            </w:pPr>
+            <w:r/>
+            <w:r>
+              <w:rPr>
+                <w:b w:val="0"/>
+                <w:sz w:val="18"/>
+              </w:rPr>
+              <w:t>Learner sign-in</w:t>
+            </w:r>
+          </w:p>
+        </w:tc>
+        <w:tc>
+          <w:tcPr>
+            <w:tcW w:type="dxa" w:w="5556"/>
+          </w:tcPr>
+          <w:p>
+            <w:pPr>
+              <w:spacing w:after="0"/>
+            </w:pPr>
+            <w:r/>
+            <w:r>
+              <w:rPr>
+                <w:b w:val="0"/>
+                <w:sz w:val="18"/>
+              </w:rPr>
+              <w:t>First name is required / Family name is required</w:t>
+            </w:r>
+          </w:p>
+        </w:tc>
+        <w:tc>
+          <w:tcPr>
+            <w:tcW w:type="dxa" w:w="1701"/>
+          </w:tcPr>
+          <w:p>
+            <w:pPr>
+              <w:spacing w:after="0"/>
+            </w:pPr>
+            <w:r/>
+            <w:r>
+              <w:rPr>
+                <w:b w:val="0"/>
+                <w:sz w:val="18"/>
+              </w:rPr>
+              <w:t>Error</w:t>
             </w:r>
           </w:p>
         </w:tc>

</xml_diff>